<commit_message>
continued edditing the report with BFS and DFS
</commit_message>
<xml_diff>
--- a/Final Project- Graph Algorithms in Network Optimization .docx
+++ b/Final Project- Graph Algorithms in Network Optimization .docx
@@ -510,9 +510,14 @@
       <w:r>
         <w:rPr>
           <w:rFonts w:ascii="Times New Roman" w:hAnsi="Times New Roman" w:cs="Times New Roman"/>
-          <w:highlight w:val="yellow"/>
-        </w:rPr>
-        <w:t>travel time (in minutes) / distance (in kilometers)</w:t>
+        </w:rPr>
+        <w:t>travel time (in minutes)</w:t>
+      </w:r>
+      <w:r>
+        <w:rPr>
+          <w:rFonts w:ascii="Times New Roman" w:hAnsi="Times New Roman" w:cs="Times New Roman"/>
+        </w:rPr>
+        <w:t>.</w:t>
       </w:r>
     </w:p>
     <w:p>
@@ -551,9 +556,20 @@
       <w:r>
         <w:rPr>
           <w:rFonts w:ascii="Times New Roman" w:hAnsi="Times New Roman" w:cs="Times New Roman"/>
-          <w:highlight w:val="yellow"/>
-        </w:rPr>
-        <w:t>(time / distance)</w:t>
+        </w:rPr>
+        <w:t>(time</w:t>
+      </w:r>
+      <w:r>
+        <w:rPr>
+          <w:rFonts w:ascii="Times New Roman" w:hAnsi="Times New Roman" w:cs="Times New Roman"/>
+        </w:rPr>
+        <w:t>)</w:t>
+      </w:r>
+      <w:r>
+        <w:rPr>
+          <w:rFonts w:ascii="Times New Roman" w:hAnsi="Times New Roman" w:cs="Times New Roman"/>
+        </w:rPr>
+        <w:t>.</w:t>
       </w:r>
     </w:p>
     <w:p>
@@ -626,6 +642,961 @@
           <w:bCs/>
           <w:sz w:val="26"/>
           <w:szCs w:val="26"/>
+        </w:rPr>
+      </w:pPr>
+      <w:r>
+        <w:rPr>
+          <w:rFonts w:ascii="Times New Roman" w:hAnsi="Times New Roman" w:cs="Times New Roman"/>
+          <w:b/>
+          <w:bCs/>
+          <w:sz w:val="26"/>
+          <w:szCs w:val="26"/>
+        </w:rPr>
+        <w:t>Graph Traversal</w:t>
+      </w:r>
+    </w:p>
+    <w:p>
+      <w:pPr>
+        <w:pStyle w:val="ListParagraph"/>
+        <w:numPr>
+          <w:ilvl w:val="0"/>
+          <w:numId w:val="2"/>
+        </w:numPr>
+        <w:rPr>
+          <w:rFonts w:ascii="Times New Roman" w:hAnsi="Times New Roman" w:cs="Times New Roman"/>
+        </w:rPr>
+      </w:pPr>
+      <w:r>
+        <w:rPr>
+          <w:rFonts w:ascii="Times New Roman" w:hAnsi="Times New Roman" w:cs="Times New Roman"/>
+        </w:rPr>
+        <w:t>BFS Traversal</w:t>
+      </w:r>
+    </w:p>
+    <w:p>
+      <w:pPr>
+        <w:pStyle w:val="ListParagraph"/>
+        <w:numPr>
+          <w:ilvl w:val="1"/>
+          <w:numId w:val="2"/>
+        </w:numPr>
+        <w:rPr>
+          <w:rFonts w:ascii="Times New Roman" w:hAnsi="Times New Roman" w:cs="Times New Roman"/>
+        </w:rPr>
+      </w:pPr>
+      <w:r>
+        <w:rPr>
+          <w:rFonts w:ascii="Times New Roman" w:hAnsi="Times New Roman" w:cs="Times New Roman"/>
+        </w:rPr>
+        <w:t>Pseudocode:</w:t>
+      </w:r>
+    </w:p>
+    <w:p>
+      <w:pPr>
+        <w:pStyle w:val="ListParagraph"/>
+        <w:ind w:left="1440"/>
+        <w:rPr>
+          <w:rFonts w:ascii="Times New Roman" w:hAnsi="Times New Roman" w:cs="Times New Roman"/>
+        </w:rPr>
+      </w:pPr>
+      <w:r>
+        <w:rPr>
+          <w:rFonts w:ascii="Times New Roman" w:hAnsi="Times New Roman" w:cs="Times New Roman"/>
+        </w:rPr>
+        <w:t>BFS(</w:t>
+      </w:r>
+      <w:r>
+        <w:rPr>
+          <w:rFonts w:ascii="Times New Roman" w:hAnsi="Times New Roman" w:cs="Times New Roman"/>
+        </w:rPr>
+        <w:t>graph</w:t>
+      </w:r>
+      <w:r>
+        <w:rPr>
+          <w:rFonts w:ascii="Times New Roman" w:hAnsi="Times New Roman" w:cs="Times New Roman"/>
+        </w:rPr>
+        <w:t>, star</w:t>
+      </w:r>
+      <w:r>
+        <w:rPr>
+          <w:rFonts w:ascii="Times New Roman" w:hAnsi="Times New Roman" w:cs="Times New Roman"/>
+        </w:rPr>
+        <w:t>tNode</w:t>
+      </w:r>
+      <w:r>
+        <w:rPr>
+          <w:rFonts w:ascii="Times New Roman" w:hAnsi="Times New Roman" w:cs="Times New Roman"/>
+        </w:rPr>
+        <w:t>):</w:t>
+      </w:r>
+    </w:p>
+    <w:p>
+      <w:pPr>
+        <w:pStyle w:val="ListParagraph"/>
+        <w:ind w:left="1440"/>
+        <w:rPr>
+          <w:rFonts w:ascii="Times New Roman" w:hAnsi="Times New Roman" w:cs="Times New Roman"/>
+        </w:rPr>
+      </w:pPr>
+      <w:r>
+        <w:rPr>
+          <w:rFonts w:ascii="Times New Roman" w:hAnsi="Times New Roman" w:cs="Times New Roman"/>
+        </w:rPr>
+        <w:t xml:space="preserve">    Create a Queue Q</w:t>
+      </w:r>
+    </w:p>
+    <w:p>
+      <w:pPr>
+        <w:pStyle w:val="ListParagraph"/>
+        <w:ind w:left="1440"/>
+        <w:rPr>
+          <w:rFonts w:ascii="Times New Roman" w:hAnsi="Times New Roman" w:cs="Times New Roman"/>
+        </w:rPr>
+      </w:pPr>
+      <w:r>
+        <w:rPr>
+          <w:rFonts w:ascii="Times New Roman" w:hAnsi="Times New Roman" w:cs="Times New Roman"/>
+        </w:rPr>
+        <w:t xml:space="preserve">    Create a Visited array, init with 0</w:t>
+      </w:r>
+    </w:p>
+    <w:p>
+      <w:pPr>
+        <w:pStyle w:val="ListParagraph"/>
+        <w:ind w:left="1440"/>
+        <w:rPr>
+          <w:rFonts w:ascii="Times New Roman" w:hAnsi="Times New Roman" w:cs="Times New Roman"/>
+        </w:rPr>
+      </w:pPr>
+      <w:r>
+        <w:rPr>
+          <w:rFonts w:ascii="Times New Roman" w:hAnsi="Times New Roman" w:cs="Times New Roman"/>
+        </w:rPr>
+        <w:t xml:space="preserve">    </w:t>
+      </w:r>
+    </w:p>
+    <w:p>
+      <w:pPr>
+        <w:pStyle w:val="ListParagraph"/>
+        <w:ind w:left="1440"/>
+        <w:rPr>
+          <w:rFonts w:ascii="Times New Roman" w:hAnsi="Times New Roman" w:cs="Times New Roman"/>
+        </w:rPr>
+      </w:pPr>
+      <w:r>
+        <w:rPr>
+          <w:rFonts w:ascii="Times New Roman" w:hAnsi="Times New Roman" w:cs="Times New Roman"/>
+        </w:rPr>
+        <w:t xml:space="preserve">    Q.enqueue(startNode)</w:t>
+      </w:r>
+    </w:p>
+    <w:p>
+      <w:pPr>
+        <w:pStyle w:val="ListParagraph"/>
+        <w:ind w:left="1440"/>
+        <w:rPr>
+          <w:rFonts w:ascii="Times New Roman" w:hAnsi="Times New Roman" w:cs="Times New Roman"/>
+        </w:rPr>
+      </w:pPr>
+      <w:r>
+        <w:rPr>
+          <w:rFonts w:ascii="Times New Roman" w:hAnsi="Times New Roman" w:cs="Times New Roman"/>
+        </w:rPr>
+        <w:t xml:space="preserve">    Visited[startNode] = 1</w:t>
+      </w:r>
+    </w:p>
+    <w:p>
+      <w:pPr>
+        <w:pStyle w:val="ListParagraph"/>
+        <w:ind w:left="1440"/>
+        <w:rPr>
+          <w:rFonts w:ascii="Times New Roman" w:hAnsi="Times New Roman" w:cs="Times New Roman"/>
+        </w:rPr>
+      </w:pPr>
+      <w:r>
+        <w:rPr>
+          <w:rFonts w:ascii="Times New Roman" w:hAnsi="Times New Roman" w:cs="Times New Roman"/>
+        </w:rPr>
+        <w:t xml:space="preserve">    </w:t>
+      </w:r>
+    </w:p>
+    <w:p>
+      <w:pPr>
+        <w:pStyle w:val="ListParagraph"/>
+        <w:ind w:left="1440"/>
+        <w:rPr>
+          <w:rFonts w:ascii="Times New Roman" w:hAnsi="Times New Roman" w:cs="Times New Roman"/>
+        </w:rPr>
+      </w:pPr>
+      <w:r>
+        <w:rPr>
+          <w:rFonts w:ascii="Times New Roman" w:hAnsi="Times New Roman" w:cs="Times New Roman"/>
+        </w:rPr>
+        <w:t xml:space="preserve">    While Q is not empty:</w:t>
+      </w:r>
+    </w:p>
+    <w:p>
+      <w:pPr>
+        <w:pStyle w:val="ListParagraph"/>
+        <w:ind w:left="1440"/>
+        <w:rPr>
+          <w:rFonts w:ascii="Times New Roman" w:hAnsi="Times New Roman" w:cs="Times New Roman"/>
+        </w:rPr>
+      </w:pPr>
+      <w:r>
+        <w:rPr>
+          <w:rFonts w:ascii="Times New Roman" w:hAnsi="Times New Roman" w:cs="Times New Roman"/>
+        </w:rPr>
+        <w:t xml:space="preserve">        curr = Q.dequeue()</w:t>
+      </w:r>
+    </w:p>
+    <w:p>
+      <w:pPr>
+        <w:pStyle w:val="ListParagraph"/>
+        <w:ind w:left="1440"/>
+        <w:rPr>
+          <w:rFonts w:ascii="Times New Roman" w:hAnsi="Times New Roman" w:cs="Times New Roman"/>
+        </w:rPr>
+      </w:pPr>
+      <w:r>
+        <w:rPr>
+          <w:rFonts w:ascii="Times New Roman" w:hAnsi="Times New Roman" w:cs="Times New Roman"/>
+        </w:rPr>
+        <w:t xml:space="preserve">        Process(curr)</w:t>
+      </w:r>
+    </w:p>
+    <w:p>
+      <w:pPr>
+        <w:pStyle w:val="ListParagraph"/>
+        <w:ind w:left="1440"/>
+        <w:rPr>
+          <w:rFonts w:ascii="Times New Roman" w:hAnsi="Times New Roman" w:cs="Times New Roman"/>
+        </w:rPr>
+      </w:pPr>
+      <w:r>
+        <w:rPr>
+          <w:rFonts w:ascii="Times New Roman" w:hAnsi="Times New Roman" w:cs="Times New Roman"/>
+        </w:rPr>
+        <w:t xml:space="preserve">        </w:t>
+      </w:r>
+    </w:p>
+    <w:p>
+      <w:pPr>
+        <w:pStyle w:val="ListParagraph"/>
+        <w:ind w:left="1440"/>
+        <w:rPr>
+          <w:rFonts w:ascii="Times New Roman" w:hAnsi="Times New Roman" w:cs="Times New Roman"/>
+        </w:rPr>
+      </w:pPr>
+      <w:r>
+        <w:rPr>
+          <w:rFonts w:ascii="Times New Roman" w:hAnsi="Times New Roman" w:cs="Times New Roman"/>
+        </w:rPr>
+        <w:t xml:space="preserve">        For neighbor from 0 to V-1:</w:t>
+      </w:r>
+    </w:p>
+    <w:p>
+      <w:pPr>
+        <w:pStyle w:val="ListParagraph"/>
+        <w:ind w:left="1440"/>
+        <w:rPr>
+          <w:rFonts w:ascii="Times New Roman" w:hAnsi="Times New Roman" w:cs="Times New Roman"/>
+        </w:rPr>
+      </w:pPr>
+      <w:r>
+        <w:rPr>
+          <w:rFonts w:ascii="Times New Roman" w:hAnsi="Times New Roman" w:cs="Times New Roman"/>
+        </w:rPr>
+        <w:t xml:space="preserve">            If matrix[curr][neighbor] == 1 AND Visited[neighbor] == 0:</w:t>
+      </w:r>
+    </w:p>
+    <w:p>
+      <w:pPr>
+        <w:pStyle w:val="ListParagraph"/>
+        <w:ind w:left="1440"/>
+        <w:rPr>
+          <w:rFonts w:ascii="Times New Roman" w:hAnsi="Times New Roman" w:cs="Times New Roman"/>
+        </w:rPr>
+      </w:pPr>
+      <w:r>
+        <w:rPr>
+          <w:rFonts w:ascii="Times New Roman" w:hAnsi="Times New Roman" w:cs="Times New Roman"/>
+        </w:rPr>
+        <w:t xml:space="preserve">                Visited[neighbor] = 1</w:t>
+      </w:r>
+    </w:p>
+    <w:p>
+      <w:pPr>
+        <w:pStyle w:val="ListParagraph"/>
+        <w:ind w:left="1440"/>
+        <w:rPr>
+          <w:rFonts w:ascii="Times New Roman" w:hAnsi="Times New Roman" w:cs="Times New Roman"/>
+        </w:rPr>
+      </w:pPr>
+      <w:r>
+        <w:rPr>
+          <w:rFonts w:ascii="Times New Roman" w:hAnsi="Times New Roman" w:cs="Times New Roman"/>
+        </w:rPr>
+        <w:t xml:space="preserve">                Q.enqueue(neighbor)</w:t>
+      </w:r>
+    </w:p>
+    <w:p>
+      <w:pPr>
+        <w:pStyle w:val="ListParagraph"/>
+        <w:ind w:left="1440"/>
+        <w:rPr>
+          <w:rFonts w:ascii="Times New Roman" w:hAnsi="Times New Roman" w:cs="Times New Roman"/>
+        </w:rPr>
+      </w:pPr>
+    </w:p>
+    <w:p>
+      <w:pPr>
+        <w:pStyle w:val="ListParagraph"/>
+        <w:numPr>
+          <w:ilvl w:val="1"/>
+          <w:numId w:val="2"/>
+        </w:numPr>
+        <w:rPr>
+          <w:rFonts w:ascii="Times New Roman" w:hAnsi="Times New Roman" w:cs="Times New Roman"/>
+        </w:rPr>
+      </w:pPr>
+      <w:r>
+        <w:rPr>
+          <w:rFonts w:ascii="Times New Roman" w:hAnsi="Times New Roman" w:cs="Times New Roman"/>
+        </w:rPr>
+        <w:t>Time Complexity</w:t>
+      </w:r>
+      <w:r>
+        <w:rPr>
+          <w:rFonts w:ascii="Times New Roman" w:hAnsi="Times New Roman" w:cs="Times New Roman"/>
+        </w:rPr>
+        <w:t>:</w:t>
+      </w:r>
+      <w:r>
+        <w:rPr>
+          <w:rFonts w:ascii="Times New Roman" w:hAnsi="Times New Roman" w:cs="Times New Roman"/>
+        </w:rPr>
+        <w:t xml:space="preserve"> O(V</w:t>
+      </w:r>
+      <w:r>
+        <w:rPr>
+          <w:rFonts w:ascii="Times New Roman" w:hAnsi="Times New Roman" w:cs="Times New Roman"/>
+          <w:vertAlign w:val="superscript"/>
+        </w:rPr>
+        <w:t>2</w:t>
+      </w:r>
+      <w:r>
+        <w:rPr>
+          <w:rFonts w:ascii="Times New Roman" w:hAnsi="Times New Roman" w:cs="Times New Roman"/>
+        </w:rPr>
+        <w:t xml:space="preserve">) since every vertex is enqueued and dequeued exactly once, which takes O(V), and for each dequeue operation the algorithm will scan its entire row in the adjacency matrix to identify which neighbors are connected, </w:t>
+      </w:r>
+      <w:r>
+        <w:rPr>
+          <w:rFonts w:ascii="Times New Roman" w:hAnsi="Times New Roman" w:cs="Times New Roman"/>
+        </w:rPr>
+        <w:lastRenderedPageBreak/>
+        <w:t>taking O(V). Since the O(V) scan is performed for every of the V vertices, the total time complexity is O(V) * O(V) = O(V</w:t>
+      </w:r>
+      <w:r>
+        <w:rPr>
+          <w:rFonts w:ascii="Times New Roman" w:hAnsi="Times New Roman" w:cs="Times New Roman"/>
+          <w:vertAlign w:val="superscript"/>
+        </w:rPr>
+        <w:t>2</w:t>
+      </w:r>
+      <w:r>
+        <w:rPr>
+          <w:rFonts w:ascii="Times New Roman" w:hAnsi="Times New Roman" w:cs="Times New Roman"/>
+        </w:rPr>
+        <w:t>)</w:t>
+      </w:r>
+      <w:r>
+        <w:rPr>
+          <w:rFonts w:ascii="Times New Roman" w:hAnsi="Times New Roman" w:cs="Times New Roman"/>
+        </w:rPr>
+        <w:t>.</w:t>
+      </w:r>
+    </w:p>
+    <w:p>
+      <w:pPr>
+        <w:pStyle w:val="ListParagraph"/>
+        <w:ind w:left="1440"/>
+        <w:rPr>
+          <w:rFonts w:ascii="Times New Roman" w:hAnsi="Times New Roman" w:cs="Times New Roman"/>
+        </w:rPr>
+      </w:pPr>
+    </w:p>
+    <w:p>
+      <w:pPr>
+        <w:pStyle w:val="ListParagraph"/>
+        <w:numPr>
+          <w:ilvl w:val="1"/>
+          <w:numId w:val="2"/>
+        </w:numPr>
+        <w:rPr>
+          <w:rFonts w:ascii="Times New Roman" w:hAnsi="Times New Roman" w:cs="Times New Roman"/>
+        </w:rPr>
+      </w:pPr>
+      <w:r>
+        <w:rPr>
+          <w:rFonts w:ascii="Times New Roman" w:hAnsi="Times New Roman" w:cs="Times New Roman"/>
+        </w:rPr>
+        <w:t>Space Complexity: O(V) since we need space for both the queue and visited arrays, each taking O(V), adding to O(</w:t>
+      </w:r>
+      <w:r>
+        <w:rPr>
+          <w:rFonts w:ascii="Times New Roman" w:hAnsi="Times New Roman" w:cs="Times New Roman"/>
+        </w:rPr>
+        <w:t>2</w:t>
+      </w:r>
+      <w:r>
+        <w:rPr>
+          <w:rFonts w:ascii="Times New Roman" w:hAnsi="Times New Roman" w:cs="Times New Roman"/>
+        </w:rPr>
+        <w:t>V)</w:t>
+      </w:r>
+      <w:r>
+        <w:rPr>
+          <w:rFonts w:ascii="Times New Roman" w:hAnsi="Times New Roman" w:cs="Times New Roman"/>
+        </w:rPr>
+        <w:t xml:space="preserve"> = O(V)</w:t>
+      </w:r>
+      <w:r>
+        <w:rPr>
+          <w:rFonts w:ascii="Times New Roman" w:hAnsi="Times New Roman" w:cs="Times New Roman"/>
+        </w:rPr>
+        <w:t>.</w:t>
+      </w:r>
+    </w:p>
+    <w:p>
+      <w:pPr>
+        <w:pStyle w:val="ListParagraph"/>
+        <w:rPr>
+          <w:rFonts w:ascii="Times New Roman" w:hAnsi="Times New Roman" w:cs="Times New Roman"/>
+        </w:rPr>
+      </w:pPr>
+    </w:p>
+    <w:p>
+      <w:pPr>
+        <w:pStyle w:val="ListParagraph"/>
+        <w:numPr>
+          <w:ilvl w:val="1"/>
+          <w:numId w:val="2"/>
+        </w:numPr>
+        <w:rPr>
+          <w:rFonts w:ascii="Times New Roman" w:hAnsi="Times New Roman" w:cs="Times New Roman"/>
+        </w:rPr>
+      </w:pPr>
+      <w:r>
+        <w:rPr>
+          <w:rFonts w:ascii="Times New Roman" w:hAnsi="Times New Roman" w:cs="Times New Roman"/>
+        </w:rPr>
+        <w:t xml:space="preserve">Best/Worst Case Discussion: </w:t>
+      </w:r>
+      <w:r>
+        <w:rPr>
+          <w:rFonts w:ascii="Times New Roman" w:hAnsi="Times New Roman" w:cs="Times New Roman"/>
+        </w:rPr>
+        <w:t xml:space="preserve">There are no better or worse cases since their time complexity is tied to the total number of vertices V. This algorithm is designed to explore every node </w:t>
+      </w:r>
+      <w:r>
+        <w:rPr>
+          <w:rFonts w:ascii="Times New Roman" w:hAnsi="Times New Roman" w:cs="Times New Roman"/>
+        </w:rPr>
+        <w:t>in all cases.</w:t>
+      </w:r>
+      <w:r>
+        <w:rPr>
+          <w:rFonts w:ascii="Times New Roman" w:hAnsi="Times New Roman" w:cs="Times New Roman"/>
+        </w:rPr>
+        <w:t xml:space="preserve"> </w:t>
+      </w:r>
+      <w:r>
+        <w:rPr>
+          <w:rFonts w:ascii="Times New Roman" w:hAnsi="Times New Roman" w:cs="Times New Roman"/>
+        </w:rPr>
+        <w:tab/>
+      </w:r>
+    </w:p>
+    <w:p>
+      <w:pPr>
+        <w:rPr>
+          <w:rFonts w:ascii="Times New Roman" w:hAnsi="Times New Roman" w:cs="Times New Roman"/>
+        </w:rPr>
+      </w:pPr>
+    </w:p>
+    <w:p>
+      <w:pPr>
+        <w:pStyle w:val="ListParagraph"/>
+        <w:numPr>
+          <w:ilvl w:val="0"/>
+          <w:numId w:val="2"/>
+        </w:numPr>
+        <w:rPr>
+          <w:rFonts w:ascii="Times New Roman" w:hAnsi="Times New Roman" w:cs="Times New Roman"/>
+        </w:rPr>
+      </w:pPr>
+      <w:r>
+        <w:rPr>
+          <w:rFonts w:ascii="Times New Roman" w:hAnsi="Times New Roman" w:cs="Times New Roman"/>
+        </w:rPr>
+        <w:t>D</w:t>
+      </w:r>
+      <w:r>
+        <w:rPr>
+          <w:rFonts w:ascii="Times New Roman" w:hAnsi="Times New Roman" w:cs="Times New Roman"/>
+        </w:rPr>
+        <w:t>FS Traversal</w:t>
+      </w:r>
+    </w:p>
+    <w:p>
+      <w:pPr>
+        <w:pStyle w:val="ListParagraph"/>
+        <w:numPr>
+          <w:ilvl w:val="1"/>
+          <w:numId w:val="2"/>
+        </w:numPr>
+        <w:rPr>
+          <w:rFonts w:ascii="Times New Roman" w:hAnsi="Times New Roman" w:cs="Times New Roman"/>
+        </w:rPr>
+      </w:pPr>
+      <w:r>
+        <w:rPr>
+          <w:rFonts w:ascii="Times New Roman" w:hAnsi="Times New Roman" w:cs="Times New Roman"/>
+        </w:rPr>
+        <w:t>Pseudocode:</w:t>
+      </w:r>
+    </w:p>
+    <w:p>
+      <w:pPr>
+        <w:pStyle w:val="ListParagraph"/>
+        <w:ind w:left="1440"/>
+        <w:rPr>
+          <w:rFonts w:ascii="Times New Roman" w:hAnsi="Times New Roman" w:cs="Times New Roman"/>
+        </w:rPr>
+      </w:pPr>
+      <w:r>
+        <w:rPr>
+          <w:rFonts w:ascii="Times New Roman" w:hAnsi="Times New Roman" w:cs="Times New Roman"/>
+        </w:rPr>
+        <w:t>DFS(</w:t>
+      </w:r>
+      <w:r>
+        <w:rPr>
+          <w:rFonts w:ascii="Times New Roman" w:hAnsi="Times New Roman" w:cs="Times New Roman"/>
+        </w:rPr>
+        <w:t>graph</w:t>
+      </w:r>
+      <w:r>
+        <w:rPr>
+          <w:rFonts w:ascii="Times New Roman" w:hAnsi="Times New Roman" w:cs="Times New Roman"/>
+        </w:rPr>
+        <w:t xml:space="preserve">, </w:t>
+      </w:r>
+      <w:r>
+        <w:rPr>
+          <w:rFonts w:ascii="Times New Roman" w:hAnsi="Times New Roman" w:cs="Times New Roman"/>
+        </w:rPr>
+        <w:t>v</w:t>
+      </w:r>
+      <w:r>
+        <w:rPr>
+          <w:rFonts w:ascii="Times New Roman" w:hAnsi="Times New Roman" w:cs="Times New Roman"/>
+        </w:rPr>
+        <w:t>isited</w:t>
+      </w:r>
+      <w:r>
+        <w:rPr>
+          <w:rFonts w:ascii="Times New Roman" w:hAnsi="Times New Roman" w:cs="Times New Roman"/>
+        </w:rPr>
+        <w:t xml:space="preserve"> array</w:t>
+      </w:r>
+      <w:r>
+        <w:rPr>
+          <w:rFonts w:ascii="Times New Roman" w:hAnsi="Times New Roman" w:cs="Times New Roman"/>
+        </w:rPr>
+        <w:t xml:space="preserve">, </w:t>
+      </w:r>
+      <w:r>
+        <w:rPr>
+          <w:rFonts w:ascii="Times New Roman" w:hAnsi="Times New Roman" w:cs="Times New Roman"/>
+        </w:rPr>
+        <w:t>currNode</w:t>
+      </w:r>
+      <w:r>
+        <w:rPr>
+          <w:rFonts w:ascii="Times New Roman" w:hAnsi="Times New Roman" w:cs="Times New Roman"/>
+        </w:rPr>
+        <w:t>):</w:t>
+      </w:r>
+    </w:p>
+    <w:p>
+      <w:pPr>
+        <w:pStyle w:val="ListParagraph"/>
+        <w:ind w:left="1440"/>
+        <w:rPr>
+          <w:rFonts w:ascii="Times New Roman" w:hAnsi="Times New Roman" w:cs="Times New Roman"/>
+        </w:rPr>
+      </w:pPr>
+      <w:r>
+        <w:rPr>
+          <w:rFonts w:ascii="Times New Roman" w:hAnsi="Times New Roman" w:cs="Times New Roman"/>
+        </w:rPr>
+        <w:t xml:space="preserve">    Visited[curr] = 1</w:t>
+      </w:r>
+    </w:p>
+    <w:p>
+      <w:pPr>
+        <w:pStyle w:val="ListParagraph"/>
+        <w:ind w:left="1440"/>
+        <w:rPr>
+          <w:rFonts w:ascii="Times New Roman" w:hAnsi="Times New Roman" w:cs="Times New Roman"/>
+        </w:rPr>
+      </w:pPr>
+      <w:r>
+        <w:rPr>
+          <w:rFonts w:ascii="Times New Roman" w:hAnsi="Times New Roman" w:cs="Times New Roman"/>
+        </w:rPr>
+        <w:t xml:space="preserve">    Process(curr)</w:t>
+      </w:r>
+    </w:p>
+    <w:p>
+      <w:pPr>
+        <w:pStyle w:val="ListParagraph"/>
+        <w:ind w:left="1440"/>
+        <w:rPr>
+          <w:rFonts w:ascii="Times New Roman" w:hAnsi="Times New Roman" w:cs="Times New Roman"/>
+        </w:rPr>
+      </w:pPr>
+      <w:r>
+        <w:rPr>
+          <w:rFonts w:ascii="Times New Roman" w:hAnsi="Times New Roman" w:cs="Times New Roman"/>
+        </w:rPr>
+        <w:t xml:space="preserve">    </w:t>
+      </w:r>
+    </w:p>
+    <w:p>
+      <w:pPr>
+        <w:pStyle w:val="ListParagraph"/>
+        <w:ind w:left="1440"/>
+        <w:rPr>
+          <w:rFonts w:ascii="Times New Roman" w:hAnsi="Times New Roman" w:cs="Times New Roman"/>
+        </w:rPr>
+      </w:pPr>
+      <w:r>
+        <w:rPr>
+          <w:rFonts w:ascii="Times New Roman" w:hAnsi="Times New Roman" w:cs="Times New Roman"/>
+        </w:rPr>
+        <w:t xml:space="preserve">    For neighbor from 0 to V-1:</w:t>
+      </w:r>
+    </w:p>
+    <w:p>
+      <w:pPr>
+        <w:pStyle w:val="ListParagraph"/>
+        <w:ind w:left="1440"/>
+        <w:rPr>
+          <w:rFonts w:ascii="Times New Roman" w:hAnsi="Times New Roman" w:cs="Times New Roman"/>
+        </w:rPr>
+      </w:pPr>
+      <w:r>
+        <w:rPr>
+          <w:rFonts w:ascii="Times New Roman" w:hAnsi="Times New Roman" w:cs="Times New Roman"/>
+        </w:rPr>
+        <w:t xml:space="preserve">        If matrix[curr][neighbor] == 1 AND Visited[neighbor] == 0:</w:t>
+      </w:r>
+    </w:p>
+    <w:p>
+      <w:pPr>
+        <w:pStyle w:val="ListParagraph"/>
+        <w:ind w:left="1440"/>
+        <w:rPr>
+          <w:rFonts w:ascii="Times New Roman" w:hAnsi="Times New Roman" w:cs="Times New Roman"/>
+        </w:rPr>
+      </w:pPr>
+      <w:r>
+        <w:rPr>
+          <w:rFonts w:ascii="Times New Roman" w:hAnsi="Times New Roman" w:cs="Times New Roman"/>
+        </w:rPr>
+        <w:t xml:space="preserve">            DFS(</w:t>
+      </w:r>
+      <w:r>
+        <w:rPr>
+          <w:rFonts w:ascii="Times New Roman" w:hAnsi="Times New Roman" w:cs="Times New Roman"/>
+        </w:rPr>
+        <w:t>graph</w:t>
+      </w:r>
+      <w:r>
+        <w:rPr>
+          <w:rFonts w:ascii="Times New Roman" w:hAnsi="Times New Roman" w:cs="Times New Roman"/>
+        </w:rPr>
+        <w:t xml:space="preserve">, </w:t>
+      </w:r>
+      <w:r>
+        <w:rPr>
+          <w:rFonts w:ascii="Times New Roman" w:hAnsi="Times New Roman" w:cs="Times New Roman"/>
+        </w:rPr>
+        <w:t>visited</w:t>
+      </w:r>
+      <w:r>
+        <w:rPr>
+          <w:rFonts w:ascii="Times New Roman" w:hAnsi="Times New Roman" w:cs="Times New Roman"/>
+        </w:rPr>
+        <w:t xml:space="preserve">, </w:t>
+      </w:r>
+      <w:r>
+        <w:rPr>
+          <w:rFonts w:ascii="Times New Roman" w:hAnsi="Times New Roman" w:cs="Times New Roman"/>
+        </w:rPr>
+        <w:t>neighbor</w:t>
+      </w:r>
+      <w:r>
+        <w:rPr>
+          <w:rFonts w:ascii="Times New Roman" w:hAnsi="Times New Roman" w:cs="Times New Roman"/>
+        </w:rPr>
+        <w:t>)</w:t>
+      </w:r>
+    </w:p>
+    <w:p>
+      <w:pPr>
+        <w:pStyle w:val="ListParagraph"/>
+        <w:ind w:left="1440"/>
+        <w:rPr>
+          <w:rFonts w:ascii="Times New Roman" w:hAnsi="Times New Roman" w:cs="Times New Roman"/>
+        </w:rPr>
+      </w:pPr>
+    </w:p>
+    <w:p>
+      <w:pPr>
+        <w:pStyle w:val="ListParagraph"/>
+        <w:numPr>
+          <w:ilvl w:val="1"/>
+          <w:numId w:val="2"/>
+        </w:numPr>
+        <w:rPr>
+          <w:rFonts w:ascii="Times New Roman" w:hAnsi="Times New Roman" w:cs="Times New Roman"/>
+        </w:rPr>
+      </w:pPr>
+      <w:r>
+        <w:rPr>
+          <w:rFonts w:ascii="Times New Roman" w:hAnsi="Times New Roman" w:cs="Times New Roman"/>
+        </w:rPr>
+        <w:t>Time Complexity: O(V</w:t>
+      </w:r>
+      <w:r>
+        <w:rPr>
+          <w:rFonts w:ascii="Times New Roman" w:hAnsi="Times New Roman" w:cs="Times New Roman"/>
+          <w:vertAlign w:val="superscript"/>
+        </w:rPr>
+        <w:t>2</w:t>
+      </w:r>
+      <w:r>
+        <w:rPr>
+          <w:rFonts w:ascii="Times New Roman" w:hAnsi="Times New Roman" w:cs="Times New Roman"/>
+        </w:rPr>
+        <w:t xml:space="preserve">) since every vertex is </w:t>
+      </w:r>
+      <w:r>
+        <w:rPr>
+          <w:rFonts w:ascii="Times New Roman" w:hAnsi="Times New Roman" w:cs="Times New Roman"/>
+        </w:rPr>
+        <w:t>visited</w:t>
+      </w:r>
+      <w:r>
+        <w:rPr>
+          <w:rFonts w:ascii="Times New Roman" w:hAnsi="Times New Roman" w:cs="Times New Roman"/>
+        </w:rPr>
+        <w:t xml:space="preserve"> exactly once, which takes O(V), and for each </w:t>
+      </w:r>
+      <w:r>
+        <w:rPr>
+          <w:rFonts w:ascii="Times New Roman" w:hAnsi="Times New Roman" w:cs="Times New Roman"/>
+        </w:rPr>
+        <w:t>vertex being visited</w:t>
+      </w:r>
+      <w:r>
+        <w:rPr>
+          <w:rFonts w:ascii="Times New Roman" w:hAnsi="Times New Roman" w:cs="Times New Roman"/>
+        </w:rPr>
+        <w:t xml:space="preserve"> the algorithm will scan its entire row in the adjacency matrix to identify which neighbors are connected, taking O(V). Since the O(V) scan is performed for every of the V vertices, the total time complexity is O(V) * O(V) = O(V</w:t>
+      </w:r>
+      <w:r>
+        <w:rPr>
+          <w:rFonts w:ascii="Times New Roman" w:hAnsi="Times New Roman" w:cs="Times New Roman"/>
+          <w:vertAlign w:val="superscript"/>
+        </w:rPr>
+        <w:t>2</w:t>
+      </w:r>
+      <w:r>
+        <w:rPr>
+          <w:rFonts w:ascii="Times New Roman" w:hAnsi="Times New Roman" w:cs="Times New Roman"/>
+        </w:rPr>
+        <w:t>)</w:t>
+      </w:r>
+      <w:r>
+        <w:rPr>
+          <w:rFonts w:ascii="Times New Roman" w:hAnsi="Times New Roman" w:cs="Times New Roman"/>
+        </w:rPr>
+        <w:t>.</w:t>
+      </w:r>
+    </w:p>
+    <w:p>
+      <w:pPr>
+        <w:pStyle w:val="ListParagraph"/>
+        <w:ind w:left="1440"/>
+        <w:rPr>
+          <w:rFonts w:ascii="Times New Roman" w:hAnsi="Times New Roman" w:cs="Times New Roman"/>
+        </w:rPr>
+      </w:pPr>
+    </w:p>
+    <w:p>
+      <w:pPr>
+        <w:pStyle w:val="ListParagraph"/>
+        <w:numPr>
+          <w:ilvl w:val="1"/>
+          <w:numId w:val="2"/>
+        </w:numPr>
+        <w:rPr>
+          <w:rFonts w:ascii="Times New Roman" w:hAnsi="Times New Roman" w:cs="Times New Roman"/>
+        </w:rPr>
+      </w:pPr>
+      <w:r>
+        <w:rPr>
+          <w:rFonts w:ascii="Times New Roman" w:hAnsi="Times New Roman" w:cs="Times New Roman"/>
+        </w:rPr>
+        <w:t xml:space="preserve">Space Complexity: </w:t>
+      </w:r>
+      <w:r>
+        <w:rPr>
+          <w:rFonts w:ascii="Times New Roman" w:hAnsi="Times New Roman" w:cs="Times New Roman"/>
+        </w:rPr>
+        <w:t xml:space="preserve">O(V) since </w:t>
+      </w:r>
+      <w:r>
+        <w:rPr>
+          <w:rFonts w:ascii="Times New Roman" w:hAnsi="Times New Roman" w:cs="Times New Roman"/>
+        </w:rPr>
+        <w:t xml:space="preserve">similar to the BFS algorithm, </w:t>
+      </w:r>
+      <w:r>
+        <w:rPr>
+          <w:rFonts w:ascii="Times New Roman" w:hAnsi="Times New Roman" w:cs="Times New Roman"/>
+        </w:rPr>
+        <w:t xml:space="preserve">we need space for both the </w:t>
+      </w:r>
+      <w:r>
+        <w:rPr>
+          <w:rFonts w:ascii="Times New Roman" w:hAnsi="Times New Roman" w:cs="Times New Roman"/>
+        </w:rPr>
+        <w:t>visited array</w:t>
+      </w:r>
+      <w:r>
+        <w:rPr>
+          <w:rFonts w:ascii="Times New Roman" w:hAnsi="Times New Roman" w:cs="Times New Roman"/>
+        </w:rPr>
+        <w:t xml:space="preserve"> and </w:t>
+      </w:r>
+      <w:r>
+        <w:rPr>
+          <w:rFonts w:ascii="Times New Roman" w:hAnsi="Times New Roman" w:cs="Times New Roman"/>
+        </w:rPr>
+        <w:t>the recursion stack</w:t>
+      </w:r>
+      <w:r>
+        <w:rPr>
+          <w:rFonts w:ascii="Times New Roman" w:hAnsi="Times New Roman" w:cs="Times New Roman"/>
+        </w:rPr>
+        <w:t>, adding O(V).</w:t>
+      </w:r>
+    </w:p>
+    <w:p>
+      <w:pPr>
+        <w:pStyle w:val="ListParagraph"/>
+        <w:rPr>
+          <w:rFonts w:ascii="Times New Roman" w:hAnsi="Times New Roman" w:cs="Times New Roman"/>
+        </w:rPr>
+      </w:pPr>
+    </w:p>
+    <w:p>
+      <w:pPr>
+        <w:pStyle w:val="ListParagraph"/>
+        <w:numPr>
+          <w:ilvl w:val="1"/>
+          <w:numId w:val="2"/>
+        </w:numPr>
+        <w:rPr>
+          <w:rFonts w:ascii="Times New Roman" w:hAnsi="Times New Roman" w:cs="Times New Roman"/>
+        </w:rPr>
+      </w:pPr>
+      <w:r>
+        <w:rPr>
+          <w:rFonts w:ascii="Times New Roman" w:hAnsi="Times New Roman" w:cs="Times New Roman"/>
+        </w:rPr>
+        <w:t xml:space="preserve">Best/Worst Case Discussion: </w:t>
+      </w:r>
+      <w:r>
+        <w:rPr>
+          <w:rFonts w:ascii="Times New Roman" w:hAnsi="Times New Roman" w:cs="Times New Roman"/>
+        </w:rPr>
+        <w:t>There are no better or worse cases since their time complexity is tied to the total number of vertices V. This algorithm is designed to explore every node in all cases.</w:t>
+      </w:r>
+    </w:p>
+    <w:p>
+      <w:pPr>
+        <w:pStyle w:val="ListParagraph"/>
+        <w:rPr>
+          <w:rFonts w:ascii="Times New Roman" w:hAnsi="Times New Roman" w:cs="Times New Roman"/>
+        </w:rPr>
+      </w:pPr>
+    </w:p>
+    <w:p>
+      <w:pPr>
+        <w:rPr>
+          <w:rFonts w:ascii="Times New Roman" w:hAnsi="Times New Roman" w:cs="Times New Roman"/>
+          <w:b/>
+          <w:bCs/>
+          <w:sz w:val="26"/>
+          <w:szCs w:val="26"/>
+        </w:rPr>
+      </w:pPr>
+      <w:r>
+        <w:rPr>
+          <w:rFonts w:ascii="Times New Roman" w:hAnsi="Times New Roman" w:cs="Times New Roman"/>
+          <w:b/>
+          <w:bCs/>
+          <w:sz w:val="26"/>
+          <w:szCs w:val="26"/>
+        </w:rPr>
+        <w:t>Shortest Path</w:t>
+      </w:r>
+    </w:p>
+    <w:p>
+      <w:pPr>
+        <w:rPr>
+          <w:rFonts w:ascii="Times New Roman" w:hAnsi="Times New Roman" w:cs="Times New Roman"/>
+          <w:b/>
+          <w:bCs/>
+          <w:sz w:val="26"/>
+          <w:szCs w:val="26"/>
+        </w:rPr>
+      </w:pPr>
+      <w:r>
+        <w:rPr>
+          <w:rFonts w:ascii="Times New Roman" w:hAnsi="Times New Roman" w:cs="Times New Roman"/>
+          <w:b/>
+          <w:bCs/>
+          <w:sz w:val="26"/>
+          <w:szCs w:val="26"/>
+        </w:rPr>
+        <w:t>MST</w:t>
+      </w:r>
+    </w:p>
+    <w:p>
+      <w:pPr>
+        <w:pStyle w:val="ListParagraph"/>
+        <w:ind w:left="1440"/>
+        <w:rPr>
+          <w:rFonts w:ascii="Times New Roman" w:hAnsi="Times New Roman" w:cs="Times New Roman"/>
         </w:rPr>
       </w:pPr>
     </w:p>
@@ -780,7 +1751,7 @@
         <w:rFonts w:ascii="Times New Roman" w:eastAsiaTheme="minorHAnsi" w:hAnsi="Times New Roman" w:cs="Times New Roman" w:hint="default"/>
       </w:rPr>
     </w:lvl>
-    <w:lvl w:ilvl="1" w:tplc="04090003" w:tentative="1">
+    <w:lvl w:ilvl="1" w:tplc="04090003">
       <w:start w:val="1"/>
       <w:numFmt w:val="bullet"/>
       <w:lvlText w:val="o"/>

</xml_diff>

<commit_message>
added the results part for BFS and DFS
</commit_message>
<xml_diff>
--- a/Final Project- Graph Algorithms in Network Optimization .docx
+++ b/Final Project- Graph Algorithms in Network Optimization .docx
@@ -1661,6 +1661,469 @@
           <w:szCs w:val="26"/>
         </w:rPr>
       </w:pPr>
+      <w:r>
+        <w:rPr>
+          <w:rFonts w:ascii="Times New Roman" w:hAnsi="Times New Roman" w:cs="Times New Roman"/>
+          <w:b/>
+          <w:bCs/>
+          <w:sz w:val="26"/>
+          <w:szCs w:val="26"/>
+        </w:rPr>
+        <w:lastRenderedPageBreak/>
+        <w:t>Execution Time</w:t>
+      </w:r>
+    </w:p>
+    <w:tbl>
+      <w:tblPr>
+        <w:tblStyle w:val="TableGrid"/>
+        <w:tblW w:w="0" w:type="auto"/>
+        <w:tblLook w:val="04A0" w:firstRow="1" w:lastRow="0" w:firstColumn="1" w:lastColumn="0" w:noHBand="0" w:noVBand="1"/>
+      </w:tblPr>
+      <w:tblGrid>
+        <w:gridCol w:w="2337"/>
+        <w:gridCol w:w="2337"/>
+        <w:gridCol w:w="2338"/>
+        <w:gridCol w:w="2338"/>
+      </w:tblGrid>
+      <w:tr>
+        <w:tc>
+          <w:tcPr>
+            <w:tcW w:w="2337" w:type="dxa"/>
+          </w:tcPr>
+          <w:p>
+            <w:pPr>
+              <w:rPr>
+                <w:rFonts w:ascii="Times New Roman" w:hAnsi="Times New Roman" w:cs="Times New Roman"/>
+              </w:rPr>
+            </w:pPr>
+            <w:r>
+              <w:rPr>
+                <w:rFonts w:ascii="Times New Roman" w:hAnsi="Times New Roman" w:cs="Times New Roman"/>
+              </w:rPr>
+              <w:t>Algorithm</w:t>
+            </w:r>
+          </w:p>
+        </w:tc>
+        <w:tc>
+          <w:tcPr>
+            <w:tcW w:w="2337" w:type="dxa"/>
+          </w:tcPr>
+          <w:p>
+            <w:pPr>
+              <w:rPr>
+                <w:rFonts w:ascii="Times New Roman" w:hAnsi="Times New Roman" w:cs="Times New Roman"/>
+              </w:rPr>
+            </w:pPr>
+            <w:r>
+              <w:rPr>
+                <w:rFonts w:ascii="Times New Roman" w:hAnsi="Times New Roman" w:cs="Times New Roman"/>
+              </w:rPr>
+              <w:t>Large Dense</w:t>
+            </w:r>
+          </w:p>
+        </w:tc>
+        <w:tc>
+          <w:tcPr>
+            <w:tcW w:w="2338" w:type="dxa"/>
+          </w:tcPr>
+          <w:p>
+            <w:pPr>
+              <w:rPr>
+                <w:rFonts w:ascii="Times New Roman" w:hAnsi="Times New Roman" w:cs="Times New Roman"/>
+              </w:rPr>
+            </w:pPr>
+            <w:r>
+              <w:rPr>
+                <w:rFonts w:ascii="Times New Roman" w:hAnsi="Times New Roman" w:cs="Times New Roman"/>
+              </w:rPr>
+              <w:t>Small Sparse</w:t>
+            </w:r>
+          </w:p>
+        </w:tc>
+        <w:tc>
+          <w:tcPr>
+            <w:tcW w:w="2338" w:type="dxa"/>
+          </w:tcPr>
+          <w:p>
+            <w:pPr>
+              <w:rPr>
+                <w:rFonts w:ascii="Times New Roman" w:hAnsi="Times New Roman" w:cs="Times New Roman"/>
+              </w:rPr>
+            </w:pPr>
+            <w:r>
+              <w:rPr>
+                <w:rFonts w:ascii="Times New Roman" w:hAnsi="Times New Roman" w:cs="Times New Roman"/>
+              </w:rPr>
+              <w:t>Large Sparse</w:t>
+            </w:r>
+          </w:p>
+        </w:tc>
+      </w:tr>
+      <w:tr>
+        <w:tc>
+          <w:tcPr>
+            <w:tcW w:w="2337" w:type="dxa"/>
+          </w:tcPr>
+          <w:p>
+            <w:pPr>
+              <w:rPr>
+                <w:rFonts w:ascii="Times New Roman" w:hAnsi="Times New Roman" w:cs="Times New Roman"/>
+              </w:rPr>
+            </w:pPr>
+            <w:r>
+              <w:rPr>
+                <w:rFonts w:ascii="Times New Roman" w:hAnsi="Times New Roman" w:cs="Times New Roman"/>
+              </w:rPr>
+              <w:t>BFS</w:t>
+            </w:r>
+          </w:p>
+        </w:tc>
+        <w:tc>
+          <w:tcPr>
+            <w:tcW w:w="2337" w:type="dxa"/>
+          </w:tcPr>
+          <w:p>
+            <w:pPr>
+              <w:rPr>
+                <w:rFonts w:ascii="Times New Roman" w:hAnsi="Times New Roman" w:cs="Times New Roman"/>
+              </w:rPr>
+            </w:pPr>
+            <w:r>
+              <w:rPr>
+                <w:rFonts w:ascii="Times New Roman" w:hAnsi="Times New Roman" w:cs="Times New Roman"/>
+              </w:rPr>
+              <w:t>0.000155</w:t>
+            </w:r>
+            <w:r>
+              <w:rPr>
+                <w:rFonts w:ascii="Times New Roman" w:hAnsi="Times New Roman" w:cs="Times New Roman"/>
+              </w:rPr>
+              <w:t xml:space="preserve"> s</w:t>
+            </w:r>
+          </w:p>
+        </w:tc>
+        <w:tc>
+          <w:tcPr>
+            <w:tcW w:w="2338" w:type="dxa"/>
+          </w:tcPr>
+          <w:p>
+            <w:pPr>
+              <w:rPr>
+                <w:rFonts w:ascii="Times New Roman" w:hAnsi="Times New Roman" w:cs="Times New Roman"/>
+              </w:rPr>
+            </w:pPr>
+            <w:r>
+              <w:rPr>
+                <w:rFonts w:ascii="Times New Roman" w:hAnsi="Times New Roman" w:cs="Times New Roman"/>
+              </w:rPr>
+              <w:t>0.000036</w:t>
+            </w:r>
+            <w:r>
+              <w:rPr>
+                <w:rFonts w:ascii="Times New Roman" w:hAnsi="Times New Roman" w:cs="Times New Roman"/>
+              </w:rPr>
+              <w:t xml:space="preserve"> s</w:t>
+            </w:r>
+          </w:p>
+        </w:tc>
+        <w:tc>
+          <w:tcPr>
+            <w:tcW w:w="2338" w:type="dxa"/>
+          </w:tcPr>
+          <w:p>
+            <w:pPr>
+              <w:rPr>
+                <w:rFonts w:ascii="Times New Roman" w:hAnsi="Times New Roman" w:cs="Times New Roman"/>
+              </w:rPr>
+            </w:pPr>
+            <w:r>
+              <w:rPr>
+                <w:rFonts w:ascii="Times New Roman" w:hAnsi="Times New Roman" w:cs="Times New Roman"/>
+              </w:rPr>
+              <w:t>0.000077</w:t>
+            </w:r>
+            <w:r>
+              <w:rPr>
+                <w:rFonts w:ascii="Times New Roman" w:hAnsi="Times New Roman" w:cs="Times New Roman"/>
+              </w:rPr>
+              <w:t xml:space="preserve"> s</w:t>
+            </w:r>
+          </w:p>
+        </w:tc>
+      </w:tr>
+      <w:tr>
+        <w:tc>
+          <w:tcPr>
+            <w:tcW w:w="2337" w:type="dxa"/>
+          </w:tcPr>
+          <w:p>
+            <w:pPr>
+              <w:rPr>
+                <w:rFonts w:ascii="Times New Roman" w:hAnsi="Times New Roman" w:cs="Times New Roman"/>
+              </w:rPr>
+            </w:pPr>
+            <w:r>
+              <w:rPr>
+                <w:rFonts w:ascii="Times New Roman" w:hAnsi="Times New Roman" w:cs="Times New Roman"/>
+              </w:rPr>
+              <w:t>DFS</w:t>
+            </w:r>
+          </w:p>
+        </w:tc>
+        <w:tc>
+          <w:tcPr>
+            <w:tcW w:w="2337" w:type="dxa"/>
+          </w:tcPr>
+          <w:p>
+            <w:pPr>
+              <w:rPr>
+                <w:rFonts w:ascii="Times New Roman" w:hAnsi="Times New Roman" w:cs="Times New Roman"/>
+              </w:rPr>
+            </w:pPr>
+            <w:r>
+              <w:rPr>
+                <w:rFonts w:ascii="Times New Roman" w:hAnsi="Times New Roman" w:cs="Times New Roman"/>
+              </w:rPr>
+              <w:t>0.000123</w:t>
+            </w:r>
+            <w:r>
+              <w:rPr>
+                <w:rFonts w:ascii="Times New Roman" w:hAnsi="Times New Roman" w:cs="Times New Roman"/>
+              </w:rPr>
+              <w:t xml:space="preserve"> s</w:t>
+            </w:r>
+          </w:p>
+        </w:tc>
+        <w:tc>
+          <w:tcPr>
+            <w:tcW w:w="2338" w:type="dxa"/>
+          </w:tcPr>
+          <w:p>
+            <w:pPr>
+              <w:rPr>
+                <w:rFonts w:ascii="Times New Roman" w:hAnsi="Times New Roman" w:cs="Times New Roman"/>
+              </w:rPr>
+            </w:pPr>
+            <w:r>
+              <w:rPr>
+                <w:rFonts w:ascii="Times New Roman" w:hAnsi="Times New Roman" w:cs="Times New Roman"/>
+              </w:rPr>
+              <w:t>0.000034</w:t>
+            </w:r>
+            <w:r>
+              <w:rPr>
+                <w:rFonts w:ascii="Times New Roman" w:hAnsi="Times New Roman" w:cs="Times New Roman"/>
+              </w:rPr>
+              <w:t xml:space="preserve"> s</w:t>
+            </w:r>
+          </w:p>
+        </w:tc>
+        <w:tc>
+          <w:tcPr>
+            <w:tcW w:w="2338" w:type="dxa"/>
+          </w:tcPr>
+          <w:p>
+            <w:pPr>
+              <w:rPr>
+                <w:rFonts w:ascii="Times New Roman" w:hAnsi="Times New Roman" w:cs="Times New Roman"/>
+              </w:rPr>
+            </w:pPr>
+            <w:r>
+              <w:rPr>
+                <w:rFonts w:ascii="Times New Roman" w:hAnsi="Times New Roman" w:cs="Times New Roman"/>
+              </w:rPr>
+              <w:t>0.000076</w:t>
+            </w:r>
+            <w:r>
+              <w:rPr>
+                <w:rFonts w:ascii="Times New Roman" w:hAnsi="Times New Roman" w:cs="Times New Roman"/>
+              </w:rPr>
+              <w:t xml:space="preserve"> s</w:t>
+            </w:r>
+          </w:p>
+        </w:tc>
+      </w:tr>
+      <w:tr>
+        <w:tc>
+          <w:tcPr>
+            <w:tcW w:w="2337" w:type="dxa"/>
+          </w:tcPr>
+          <w:p>
+            <w:pPr>
+              <w:rPr>
+                <w:rFonts w:ascii="Times New Roman" w:hAnsi="Times New Roman" w:cs="Times New Roman"/>
+              </w:rPr>
+            </w:pPr>
+          </w:p>
+        </w:tc>
+        <w:tc>
+          <w:tcPr>
+            <w:tcW w:w="2337" w:type="dxa"/>
+          </w:tcPr>
+          <w:p>
+            <w:pPr>
+              <w:rPr>
+                <w:rFonts w:ascii="Times New Roman" w:hAnsi="Times New Roman" w:cs="Times New Roman"/>
+              </w:rPr>
+            </w:pPr>
+          </w:p>
+        </w:tc>
+        <w:tc>
+          <w:tcPr>
+            <w:tcW w:w="2338" w:type="dxa"/>
+          </w:tcPr>
+          <w:p>
+            <w:pPr>
+              <w:rPr>
+                <w:rFonts w:ascii="Times New Roman" w:hAnsi="Times New Roman" w:cs="Times New Roman"/>
+              </w:rPr>
+            </w:pPr>
+          </w:p>
+        </w:tc>
+        <w:tc>
+          <w:tcPr>
+            <w:tcW w:w="2338" w:type="dxa"/>
+          </w:tcPr>
+          <w:p>
+            <w:pPr>
+              <w:rPr>
+                <w:rFonts w:ascii="Times New Roman" w:hAnsi="Times New Roman" w:cs="Times New Roman"/>
+              </w:rPr>
+            </w:pPr>
+          </w:p>
+        </w:tc>
+      </w:tr>
+      <w:tr>
+        <w:tc>
+          <w:tcPr>
+            <w:tcW w:w="2337" w:type="dxa"/>
+          </w:tcPr>
+          <w:p>
+            <w:pPr>
+              <w:rPr>
+                <w:rFonts w:ascii="Times New Roman" w:hAnsi="Times New Roman" w:cs="Times New Roman"/>
+              </w:rPr>
+            </w:pPr>
+          </w:p>
+        </w:tc>
+        <w:tc>
+          <w:tcPr>
+            <w:tcW w:w="2337" w:type="dxa"/>
+          </w:tcPr>
+          <w:p>
+            <w:pPr>
+              <w:rPr>
+                <w:rFonts w:ascii="Times New Roman" w:hAnsi="Times New Roman" w:cs="Times New Roman"/>
+              </w:rPr>
+            </w:pPr>
+          </w:p>
+        </w:tc>
+        <w:tc>
+          <w:tcPr>
+            <w:tcW w:w="2338" w:type="dxa"/>
+          </w:tcPr>
+          <w:p>
+            <w:pPr>
+              <w:rPr>
+                <w:rFonts w:ascii="Times New Roman" w:hAnsi="Times New Roman" w:cs="Times New Roman"/>
+              </w:rPr>
+            </w:pPr>
+          </w:p>
+        </w:tc>
+        <w:tc>
+          <w:tcPr>
+            <w:tcW w:w="2338" w:type="dxa"/>
+          </w:tcPr>
+          <w:p>
+            <w:pPr>
+              <w:rPr>
+                <w:rFonts w:ascii="Times New Roman" w:hAnsi="Times New Roman" w:cs="Times New Roman"/>
+              </w:rPr>
+            </w:pPr>
+          </w:p>
+        </w:tc>
+      </w:tr>
+    </w:tbl>
+    <w:p>
+      <w:pPr>
+        <w:rPr>
+          <w:rFonts w:ascii="Times New Roman" w:hAnsi="Times New Roman" w:cs="Times New Roman"/>
+        </w:rPr>
+      </w:pPr>
+    </w:p>
+    <w:p>
+      <w:pPr>
+        <w:rPr>
+          <w:rFonts w:ascii="Times New Roman" w:hAnsi="Times New Roman" w:cs="Times New Roman"/>
+        </w:rPr>
+      </w:pPr>
+      <w:r>
+        <w:rPr>
+          <w:rFonts w:ascii="Times New Roman" w:hAnsi="Times New Roman" w:cs="Times New Roman"/>
+        </w:rPr>
+        <w:t xml:space="preserve">The results show that both BFS and DFS have very similar execution times due to the small size of the graphs used. However, execution time increases as the graph size grows, as seen when comparing the small sparse graph to the large sparse graph. Additionally, both algorithms take longer to execute on the large dense graph compared to sparse graphs, since more edges must be examined. BFS shows slightly higher execution time than DFS, </w:t>
+      </w:r>
+      <w:r>
+        <w:rPr>
+          <w:rFonts w:ascii="Times New Roman" w:hAnsi="Times New Roman" w:cs="Times New Roman"/>
+        </w:rPr>
+        <w:t>possibly</w:t>
+      </w:r>
+      <w:r>
+        <w:rPr>
+          <w:rFonts w:ascii="Times New Roman" w:hAnsi="Times New Roman" w:cs="Times New Roman"/>
+        </w:rPr>
+        <w:t xml:space="preserve"> due to the overhead of managing a queue and processing nodes level by level. </w:t>
+      </w:r>
+      <w:r>
+        <w:rPr>
+          <w:rFonts w:ascii="Times New Roman" w:hAnsi="Times New Roman" w:cs="Times New Roman"/>
+        </w:rPr>
+        <w:t>In terms of memory usage, BFS requires additional space for a queue to store nodes at each level, while DFS uses a stack (</w:t>
+      </w:r>
+      <w:r>
+        <w:rPr>
+          <w:rFonts w:ascii="Times New Roman" w:hAnsi="Times New Roman" w:cs="Times New Roman"/>
+        </w:rPr>
+        <w:t>from</w:t>
+      </w:r>
+      <w:r>
+        <w:rPr>
+          <w:rFonts w:ascii="Times New Roman" w:hAnsi="Times New Roman" w:cs="Times New Roman"/>
+        </w:rPr>
+        <w:t xml:space="preserve"> recursion) and typically stores fewer nodes at a time. Since the graph is implemented using an adjacency matrix, both algorithms require checking all </w:t>
+      </w:r>
+      <w:r>
+        <w:rPr>
+          <w:rFonts w:ascii="Times New Roman" w:hAnsi="Times New Roman" w:cs="Times New Roman"/>
+        </w:rPr>
+        <w:t>neighbors</w:t>
+      </w:r>
+      <w:r>
+        <w:rPr>
+          <w:rFonts w:ascii="Times New Roman" w:hAnsi="Times New Roman" w:cs="Times New Roman"/>
+        </w:rPr>
+        <w:t xml:space="preserve"> for each vertex, resulting in a time complexity of O(</w:t>
+      </w:r>
+      <w:r>
+        <w:rPr>
+          <w:rFonts w:ascii="Times New Roman" w:hAnsi="Times New Roman" w:cs="Times New Roman"/>
+        </w:rPr>
+        <w:t>V</w:t>
+      </w:r>
+      <w:r>
+        <w:rPr>
+          <w:rFonts w:ascii="Times New Roman" w:hAnsi="Times New Roman" w:cs="Times New Roman"/>
+          <w:vertAlign w:val="superscript"/>
+        </w:rPr>
+        <w:t>2</w:t>
+      </w:r>
+      <w:r>
+        <w:rPr>
+          <w:rFonts w:ascii="Times New Roman" w:hAnsi="Times New Roman" w:cs="Times New Roman"/>
+        </w:rPr>
+        <w:t>). The experimental results are consistent with this behavior.</w:t>
+      </w:r>
     </w:p>
     <w:p>
       <w:pPr>
@@ -2886,6 +3349,25 @@
       <w:spacing w:val="5"/>
     </w:rPr>
   </w:style>
+  <w:style w:type="table" w:styleId="TableGrid">
+    <w:name w:val="Table Grid"/>
+    <w:basedOn w:val="TableNormal"/>
+    <w:uiPriority w:val="39"/>
+    <w:rsid w:val="00DA50B7"/>
+    <w:pPr>
+      <w:spacing w:after="0" w:line="240" w:lineRule="auto"/>
+    </w:pPr>
+    <w:tblPr>
+      <w:tblBorders>
+        <w:top w:val="single" w:sz="4" w:space="0" w:color="auto"/>
+        <w:left w:val="single" w:sz="4" w:space="0" w:color="auto"/>
+        <w:bottom w:val="single" w:sz="4" w:space="0" w:color="auto"/>
+        <w:right w:val="single" w:sz="4" w:space="0" w:color="auto"/>
+        <w:insideH w:val="single" w:sz="4" w:space="0" w:color="auto"/>
+        <w:insideV w:val="single" w:sz="4" w:space="0" w:color="auto"/>
+      </w:tblBorders>
+    </w:tblPr>
+  </w:style>
 </w:styles>
 </file>
 

</xml_diff>

<commit_message>
added conclusion (which alg best, when use, limit)
</commit_message>
<xml_diff>
--- a/Final Project- Graph Algorithms in Network Optimization .docx
+++ b/Final Project- Graph Algorithms in Network Optimization .docx
@@ -2180,12 +2180,136 @@
       <w:pPr>
         <w:rPr>
           <w:rFonts w:ascii="Times New Roman" w:hAnsi="Times New Roman" w:cs="Times New Roman"/>
-          <w:b/>
-          <w:bCs/>
-          <w:sz w:val="26"/>
-          <w:szCs w:val="26"/>
-        </w:rPr>
-      </w:pPr>
+        </w:rPr>
+      </w:pPr>
+      <w:r>
+        <w:rPr>
+          <w:rFonts w:ascii="Times New Roman" w:hAnsi="Times New Roman" w:cs="Times New Roman"/>
+        </w:rPr>
+        <w:t xml:space="preserve">There is no single algorithm that performs best in all scenarios, </w:t>
+      </w:r>
+      <w:r>
+        <w:rPr>
+          <w:rFonts w:ascii="Times New Roman" w:hAnsi="Times New Roman" w:cs="Times New Roman"/>
+        </w:rPr>
+        <w:t>since</w:t>
+      </w:r>
+      <w:r>
+        <w:rPr>
+          <w:rFonts w:ascii="Times New Roman" w:hAnsi="Times New Roman" w:cs="Times New Roman"/>
+        </w:rPr>
+        <w:t xml:space="preserve"> each algorithm is designed for a different purpose. BFS and DFS showed the fastest execution times in the experiments due to their simple logic and lack of weight calculations. However, </w:t>
+      </w:r>
+      <w:r>
+        <w:rPr>
+          <w:rFonts w:ascii="Times New Roman" w:hAnsi="Times New Roman" w:cs="Times New Roman"/>
+        </w:rPr>
+        <w:t>Bellman-Ford is more powerful for shortest path problems because it can handle weighted graphs, including those with negative edge weights</w:t>
+      </w:r>
+      <w:r>
+        <w:rPr>
+          <w:rFonts w:ascii="Times New Roman" w:hAnsi="Times New Roman" w:cs="Times New Roman"/>
+        </w:rPr>
+        <w:t xml:space="preserve">, while Prim’s algorithm is optimal for constructing </w:t>
+      </w:r>
+      <w:r>
+        <w:rPr>
+          <w:rFonts w:ascii="Times New Roman" w:hAnsi="Times New Roman" w:cs="Times New Roman"/>
+        </w:rPr>
+        <w:t>the</w:t>
+      </w:r>
+      <w:r>
+        <w:rPr>
+          <w:rFonts w:ascii="Times New Roman" w:hAnsi="Times New Roman" w:cs="Times New Roman"/>
+        </w:rPr>
+        <w:t xml:space="preserve"> minimum spanning tree. Therefore, the “best” algorithm depends on the problem being solved</w:t>
+      </w:r>
+      <w:r>
+        <w:rPr>
+          <w:rFonts w:ascii="Times New Roman" w:hAnsi="Times New Roman" w:cs="Times New Roman"/>
+        </w:rPr>
+        <w:t>, not on the</w:t>
+      </w:r>
+      <w:r>
+        <w:rPr>
+          <w:rFonts w:ascii="Times New Roman" w:hAnsi="Times New Roman" w:cs="Times New Roman"/>
+        </w:rPr>
+        <w:t xml:space="preserve"> execution time alone.</w:t>
+      </w:r>
+    </w:p>
+    <w:p>
+      <w:pPr>
+        <w:rPr>
+          <w:rFonts w:ascii="Times New Roman" w:hAnsi="Times New Roman" w:cs="Times New Roman"/>
+        </w:rPr>
+      </w:pPr>
+      <w:r>
+        <w:rPr>
+          <w:rFonts w:ascii="Times New Roman" w:hAnsi="Times New Roman" w:cs="Times New Roman"/>
+        </w:rPr>
+        <w:t>BFS is best used when exploring a graph level by level or finding the shortest path in an unweighted graph. DFS is useful for exploring all possible paths, detecting cycles, and analyzing connectivity. Bellman-Ford should be used when finding the shortest path in weighted graphs, especially when negative edge weights may be present. Prim’s algorithm is used when the objective is to connect all nodes with the minimum total cost, making it ideal for designing efficient transportation or network systems.</w:t>
+      </w:r>
+    </w:p>
+    <w:p>
+      <w:pPr>
+        <w:rPr>
+          <w:rFonts w:ascii="Times New Roman" w:hAnsi="Times New Roman" w:cs="Times New Roman"/>
+        </w:rPr>
+      </w:pPr>
+      <w:r>
+        <w:rPr>
+          <w:rFonts w:ascii="Times New Roman" w:hAnsi="Times New Roman" w:cs="Times New Roman"/>
+        </w:rPr>
+        <w:t>BFS</w:t>
+      </w:r>
+      <w:r>
+        <w:rPr>
+          <w:rFonts w:ascii="Times New Roman" w:hAnsi="Times New Roman" w:cs="Times New Roman"/>
+        </w:rPr>
+        <w:t xml:space="preserve"> </w:t>
+      </w:r>
+      <w:r>
+        <w:rPr>
+          <w:rFonts w:ascii="Times New Roman" w:hAnsi="Times New Roman" w:cs="Times New Roman"/>
+        </w:rPr>
+        <w:t>is memory-intensive, storing all nodes at the current level, while DFS can get stuck in deep, non-optimal paths</w:t>
+      </w:r>
+      <w:r>
+        <w:rPr>
+          <w:rFonts w:ascii="Times New Roman" w:hAnsi="Times New Roman" w:cs="Times New Roman"/>
+        </w:rPr>
+        <w:t xml:space="preserve">. Bellman-Ford has a higher time complexity compared to other shortest path algorithms, which makes it slower for large graphs. </w:t>
+      </w:r>
+      <w:r>
+        <w:rPr>
+          <w:rFonts w:ascii="Times New Roman" w:hAnsi="Times New Roman" w:cs="Times New Roman"/>
+        </w:rPr>
+        <w:t xml:space="preserve">Finally, </w:t>
+      </w:r>
+      <w:r>
+        <w:rPr>
+          <w:rFonts w:ascii="Times New Roman" w:hAnsi="Times New Roman" w:cs="Times New Roman"/>
+        </w:rPr>
+        <w:t xml:space="preserve">Prim’s algorithm </w:t>
+      </w:r>
+      <w:r>
+        <w:rPr>
+          <w:rFonts w:ascii="Times New Roman" w:hAnsi="Times New Roman" w:cs="Times New Roman"/>
+        </w:rPr>
+        <w:t xml:space="preserve">is designed for undirected graphs, failing to work for directed graphs because </w:t>
+      </w:r>
+      <w:r>
+        <w:rPr>
+          <w:rFonts w:ascii="Times New Roman" w:hAnsi="Times New Roman" w:cs="Times New Roman"/>
+        </w:rPr>
+        <w:t>not every node may be reachable from every other node</w:t>
+      </w:r>
+      <w:r>
+        <w:rPr>
+          <w:rFonts w:ascii="Times New Roman" w:hAnsi="Times New Roman" w:cs="Times New Roman"/>
+        </w:rPr>
+        <w:t>.</w:t>
+      </w:r>
     </w:p>
     <w:sectPr>
       <w:pgSz w:w="12240" w:h="15840"/>

</xml_diff>

<commit_message>
all times were added
</commit_message>
<xml_diff>
--- a/Final Project- Graph Algorithms in Network Optimization .docx
+++ b/Final Project- Graph Algorithms in Network Optimization .docx
@@ -1792,7 +1792,227 @@
               <w:rPr>
                 <w:rFonts w:ascii="Times New Roman" w:hAnsi="Times New Roman" w:cs="Times New Roman"/>
               </w:rPr>
-              <w:t>0.000155</w:t>
+              <w:t>0.000042</w:t>
+            </w:r>
+            <w:r>
+              <w:rPr>
+                <w:rFonts w:ascii="Times New Roman" w:hAnsi="Times New Roman" w:cs="Times New Roman"/>
+              </w:rPr>
+              <w:t xml:space="preserve"> </w:t>
+            </w:r>
+            <w:r>
+              <w:rPr>
+                <w:rFonts w:ascii="Times New Roman" w:hAnsi="Times New Roman" w:cs="Times New Roman"/>
+              </w:rPr>
+              <w:t>s</w:t>
+            </w:r>
+          </w:p>
+        </w:tc>
+        <w:tc>
+          <w:tcPr>
+            <w:tcW w:w="2338" w:type="dxa"/>
+          </w:tcPr>
+          <w:p>
+            <w:pPr>
+              <w:rPr>
+                <w:rFonts w:ascii="Times New Roman" w:hAnsi="Times New Roman" w:cs="Times New Roman"/>
+              </w:rPr>
+            </w:pPr>
+            <w:r>
+              <w:rPr>
+                <w:rFonts w:ascii="Times New Roman" w:hAnsi="Times New Roman" w:cs="Times New Roman"/>
+              </w:rPr>
+              <w:t>0.000014</w:t>
+            </w:r>
+            <w:r>
+              <w:rPr>
+                <w:rFonts w:ascii="Times New Roman" w:hAnsi="Times New Roman" w:cs="Times New Roman"/>
+              </w:rPr>
+              <w:t xml:space="preserve"> </w:t>
+            </w:r>
+            <w:r>
+              <w:rPr>
+                <w:rFonts w:ascii="Times New Roman" w:hAnsi="Times New Roman" w:cs="Times New Roman"/>
+              </w:rPr>
+              <w:t>s</w:t>
+            </w:r>
+          </w:p>
+        </w:tc>
+        <w:tc>
+          <w:tcPr>
+            <w:tcW w:w="2338" w:type="dxa"/>
+          </w:tcPr>
+          <w:p>
+            <w:pPr>
+              <w:rPr>
+                <w:rFonts w:ascii="Times New Roman" w:hAnsi="Times New Roman" w:cs="Times New Roman"/>
+              </w:rPr>
+            </w:pPr>
+            <w:r>
+              <w:rPr>
+                <w:rFonts w:ascii="Times New Roman" w:hAnsi="Times New Roman" w:cs="Times New Roman"/>
+              </w:rPr>
+              <w:t>0.000025</w:t>
+            </w:r>
+            <w:r>
+              <w:rPr>
+                <w:rFonts w:ascii="Times New Roman" w:hAnsi="Times New Roman" w:cs="Times New Roman"/>
+              </w:rPr>
+              <w:t xml:space="preserve"> </w:t>
+            </w:r>
+            <w:r>
+              <w:rPr>
+                <w:rFonts w:ascii="Times New Roman" w:hAnsi="Times New Roman" w:cs="Times New Roman"/>
+              </w:rPr>
+              <w:t>s</w:t>
+            </w:r>
+          </w:p>
+        </w:tc>
+      </w:tr>
+      <w:tr>
+        <w:tc>
+          <w:tcPr>
+            <w:tcW w:w="2337" w:type="dxa"/>
+          </w:tcPr>
+          <w:p>
+            <w:pPr>
+              <w:rPr>
+                <w:rFonts w:ascii="Times New Roman" w:hAnsi="Times New Roman" w:cs="Times New Roman"/>
+              </w:rPr>
+            </w:pPr>
+            <w:r>
+              <w:rPr>
+                <w:rFonts w:ascii="Times New Roman" w:hAnsi="Times New Roman" w:cs="Times New Roman"/>
+              </w:rPr>
+              <w:t>DFS</w:t>
+            </w:r>
+          </w:p>
+        </w:tc>
+        <w:tc>
+          <w:tcPr>
+            <w:tcW w:w="2337" w:type="dxa"/>
+          </w:tcPr>
+          <w:p>
+            <w:pPr>
+              <w:rPr>
+                <w:rFonts w:ascii="Times New Roman" w:hAnsi="Times New Roman" w:cs="Times New Roman"/>
+              </w:rPr>
+            </w:pPr>
+            <w:r>
+              <w:rPr>
+                <w:rFonts w:ascii="Times New Roman" w:hAnsi="Times New Roman" w:cs="Times New Roman"/>
+              </w:rPr>
+              <w:t>0.000042</w:t>
+            </w:r>
+            <w:r>
+              <w:rPr>
+                <w:rFonts w:ascii="Times New Roman" w:hAnsi="Times New Roman" w:cs="Times New Roman"/>
+              </w:rPr>
+              <w:t xml:space="preserve"> </w:t>
+            </w:r>
+            <w:r>
+              <w:rPr>
+                <w:rFonts w:ascii="Times New Roman" w:hAnsi="Times New Roman" w:cs="Times New Roman"/>
+              </w:rPr>
+              <w:t>s</w:t>
+            </w:r>
+          </w:p>
+        </w:tc>
+        <w:tc>
+          <w:tcPr>
+            <w:tcW w:w="2338" w:type="dxa"/>
+          </w:tcPr>
+          <w:p>
+            <w:pPr>
+              <w:rPr>
+                <w:rFonts w:ascii="Times New Roman" w:hAnsi="Times New Roman" w:cs="Times New Roman"/>
+              </w:rPr>
+            </w:pPr>
+            <w:r>
+              <w:rPr>
+                <w:rFonts w:ascii="Times New Roman" w:hAnsi="Times New Roman" w:cs="Times New Roman"/>
+              </w:rPr>
+              <w:t>0.000015</w:t>
+            </w:r>
+            <w:r>
+              <w:rPr>
+                <w:rFonts w:ascii="Times New Roman" w:hAnsi="Times New Roman" w:cs="Times New Roman"/>
+              </w:rPr>
+              <w:t xml:space="preserve"> </w:t>
+            </w:r>
+            <w:r>
+              <w:rPr>
+                <w:rFonts w:ascii="Times New Roman" w:hAnsi="Times New Roman" w:cs="Times New Roman"/>
+              </w:rPr>
+              <w:t>s</w:t>
+            </w:r>
+          </w:p>
+        </w:tc>
+        <w:tc>
+          <w:tcPr>
+            <w:tcW w:w="2338" w:type="dxa"/>
+          </w:tcPr>
+          <w:p>
+            <w:pPr>
+              <w:rPr>
+                <w:rFonts w:ascii="Times New Roman" w:hAnsi="Times New Roman" w:cs="Times New Roman"/>
+              </w:rPr>
+            </w:pPr>
+            <w:r>
+              <w:rPr>
+                <w:rFonts w:ascii="Times New Roman" w:hAnsi="Times New Roman" w:cs="Times New Roman"/>
+              </w:rPr>
+              <w:t>0.000023</w:t>
+            </w:r>
+            <w:r>
+              <w:rPr>
+                <w:rFonts w:ascii="Times New Roman" w:hAnsi="Times New Roman" w:cs="Times New Roman"/>
+              </w:rPr>
+              <w:t xml:space="preserve"> </w:t>
+            </w:r>
+            <w:r>
+              <w:rPr>
+                <w:rFonts w:ascii="Times New Roman" w:hAnsi="Times New Roman" w:cs="Times New Roman"/>
+              </w:rPr>
+              <w:t>s</w:t>
+            </w:r>
+          </w:p>
+        </w:tc>
+      </w:tr>
+      <w:tr>
+        <w:tc>
+          <w:tcPr>
+            <w:tcW w:w="2337" w:type="dxa"/>
+          </w:tcPr>
+          <w:p>
+            <w:pPr>
+              <w:rPr>
+                <w:rFonts w:ascii="Times New Roman" w:hAnsi="Times New Roman" w:cs="Times New Roman"/>
+              </w:rPr>
+            </w:pPr>
+            <w:r>
+              <w:rPr>
+                <w:rFonts w:ascii="Times New Roman" w:hAnsi="Times New Roman" w:cs="Times New Roman"/>
+              </w:rPr>
+              <w:t>MST</w:t>
+            </w:r>
+          </w:p>
+        </w:tc>
+        <w:tc>
+          <w:tcPr>
+            <w:tcW w:w="2337" w:type="dxa"/>
+          </w:tcPr>
+          <w:p>
+            <w:pPr>
+              <w:rPr>
+                <w:rFonts w:ascii="Times New Roman" w:hAnsi="Times New Roman" w:cs="Times New Roman"/>
+              </w:rPr>
+            </w:pPr>
+            <w:r>
+              <w:rPr>
+                <w:rFonts w:ascii="Times New Roman" w:hAnsi="Times New Roman" w:cs="Times New Roman"/>
+              </w:rPr>
+              <w:t>0.000043</w:t>
             </w:r>
             <w:r>
               <w:rPr>
@@ -1816,7 +2036,7 @@
               <w:rPr>
                 <w:rFonts w:ascii="Times New Roman" w:hAnsi="Times New Roman" w:cs="Times New Roman"/>
               </w:rPr>
-              <w:t>0.000036</w:t>
+              <w:t>0.000017</w:t>
             </w:r>
             <w:r>
               <w:rPr>
@@ -1840,7 +2060,7 @@
               <w:rPr>
                 <w:rFonts w:ascii="Times New Roman" w:hAnsi="Times New Roman" w:cs="Times New Roman"/>
               </w:rPr>
-              <w:t>0.000077</w:t>
+              <w:t>0.000084</w:t>
             </w:r>
             <w:r>
               <w:rPr>
@@ -1866,7 +2086,7 @@
               <w:rPr>
                 <w:rFonts w:ascii="Times New Roman" w:hAnsi="Times New Roman" w:cs="Times New Roman"/>
               </w:rPr>
-              <w:t>DFS</w:t>
+              <w:t>Bellman-Ford</w:t>
             </w:r>
           </w:p>
         </w:tc>
@@ -1884,7 +2104,7 @@
               <w:rPr>
                 <w:rFonts w:ascii="Times New Roman" w:hAnsi="Times New Roman" w:cs="Times New Roman"/>
               </w:rPr>
-              <w:t>0.000123</w:t>
+              <w:t>0.000177</w:t>
             </w:r>
             <w:r>
               <w:rPr>
@@ -1908,7 +2128,7 @@
               <w:rPr>
                 <w:rFonts w:ascii="Times New Roman" w:hAnsi="Times New Roman" w:cs="Times New Roman"/>
               </w:rPr>
-              <w:t>0.000034</w:t>
+              <w:t>0.000188</w:t>
             </w:r>
             <w:r>
               <w:rPr>
@@ -1932,7 +2152,7 @@
               <w:rPr>
                 <w:rFonts w:ascii="Times New Roman" w:hAnsi="Times New Roman" w:cs="Times New Roman"/>
               </w:rPr>
-              <w:t>0.000076</w:t>
+              <w:t>0.000168</w:t>
             </w:r>
             <w:r>
               <w:rPr>
@@ -1943,106 +2163,6 @@
           </w:p>
         </w:tc>
       </w:tr>
-      <w:tr>
-        <w:tc>
-          <w:tcPr>
-            <w:tcW w:w="2337" w:type="dxa"/>
-          </w:tcPr>
-          <w:p>
-            <w:pPr>
-              <w:rPr>
-                <w:rFonts w:ascii="Times New Roman" w:hAnsi="Times New Roman" w:cs="Times New Roman"/>
-              </w:rPr>
-            </w:pPr>
-          </w:p>
-        </w:tc>
-        <w:tc>
-          <w:tcPr>
-            <w:tcW w:w="2337" w:type="dxa"/>
-          </w:tcPr>
-          <w:p>
-            <w:pPr>
-              <w:rPr>
-                <w:rFonts w:ascii="Times New Roman" w:hAnsi="Times New Roman" w:cs="Times New Roman"/>
-              </w:rPr>
-            </w:pPr>
-          </w:p>
-        </w:tc>
-        <w:tc>
-          <w:tcPr>
-            <w:tcW w:w="2338" w:type="dxa"/>
-          </w:tcPr>
-          <w:p>
-            <w:pPr>
-              <w:rPr>
-                <w:rFonts w:ascii="Times New Roman" w:hAnsi="Times New Roman" w:cs="Times New Roman"/>
-              </w:rPr>
-            </w:pPr>
-          </w:p>
-        </w:tc>
-        <w:tc>
-          <w:tcPr>
-            <w:tcW w:w="2338" w:type="dxa"/>
-          </w:tcPr>
-          <w:p>
-            <w:pPr>
-              <w:rPr>
-                <w:rFonts w:ascii="Times New Roman" w:hAnsi="Times New Roman" w:cs="Times New Roman"/>
-              </w:rPr>
-            </w:pPr>
-          </w:p>
-        </w:tc>
-      </w:tr>
-      <w:tr>
-        <w:tc>
-          <w:tcPr>
-            <w:tcW w:w="2337" w:type="dxa"/>
-          </w:tcPr>
-          <w:p>
-            <w:pPr>
-              <w:rPr>
-                <w:rFonts w:ascii="Times New Roman" w:hAnsi="Times New Roman" w:cs="Times New Roman"/>
-              </w:rPr>
-            </w:pPr>
-          </w:p>
-        </w:tc>
-        <w:tc>
-          <w:tcPr>
-            <w:tcW w:w="2337" w:type="dxa"/>
-          </w:tcPr>
-          <w:p>
-            <w:pPr>
-              <w:rPr>
-                <w:rFonts w:ascii="Times New Roman" w:hAnsi="Times New Roman" w:cs="Times New Roman"/>
-              </w:rPr>
-            </w:pPr>
-          </w:p>
-        </w:tc>
-        <w:tc>
-          <w:tcPr>
-            <w:tcW w:w="2338" w:type="dxa"/>
-          </w:tcPr>
-          <w:p>
-            <w:pPr>
-              <w:rPr>
-                <w:rFonts w:ascii="Times New Roman" w:hAnsi="Times New Roman" w:cs="Times New Roman"/>
-              </w:rPr>
-            </w:pPr>
-          </w:p>
-        </w:tc>
-        <w:tc>
-          <w:tcPr>
-            <w:tcW w:w="2338" w:type="dxa"/>
-          </w:tcPr>
-          <w:p>
-            <w:pPr>
-              <w:rPr>
-                <w:rFonts w:ascii="Times New Roman" w:hAnsi="Times New Roman" w:cs="Times New Roman"/>
-              </w:rPr>
-            </w:pPr>
-          </w:p>
-        </w:tc>
-      </w:tr>
     </w:tbl>
     <w:p>
       <w:pPr>
@@ -2061,19 +2181,7 @@
         <w:rPr>
           <w:rFonts w:ascii="Times New Roman" w:hAnsi="Times New Roman" w:cs="Times New Roman"/>
         </w:rPr>
-        <w:t xml:space="preserve">The results show that both BFS and DFS have very similar execution times due to the small size of the graphs used. However, execution time increases as the graph size grows, as seen when comparing the small sparse graph to the large sparse graph. Additionally, both algorithms take longer to execute on the large dense graph compared to sparse graphs, since more edges must be examined. BFS shows slightly higher execution time than DFS, </w:t>
-      </w:r>
-      <w:r>
-        <w:rPr>
-          <w:rFonts w:ascii="Times New Roman" w:hAnsi="Times New Roman" w:cs="Times New Roman"/>
-        </w:rPr>
-        <w:t>possibly</w:t>
-      </w:r>
-      <w:r>
-        <w:rPr>
-          <w:rFonts w:ascii="Times New Roman" w:hAnsi="Times New Roman" w:cs="Times New Roman"/>
-        </w:rPr>
-        <w:t xml:space="preserve"> due to the overhead of managing a queue and processing nodes level by level. </w:t>
+        <w:t xml:space="preserve">The results show that both BFS and DFS have very similar execution times due to the small size of the graphs used. However, execution time increases as the graph size grows, as seen when comparing the small sparse graph to the large sparse graph. Additionally, both algorithms take longer to execute on the large dense graph compared to sparse graphs, since more edges must be examined. </w:t>
       </w:r>
       <w:r>
         <w:rPr>

</xml_diff>

<commit_message>
formatted better the table of results
</commit_message>
<xml_diff>
--- a/Final Project- Graph Algorithms in Network Optimization .docx
+++ b/Final Project- Graph Algorithms in Network Optimization .docx
@@ -1689,9 +1689,11 @@
         <w:tc>
           <w:tcPr>
             <w:tcW w:w="2337" w:type="dxa"/>
+            <w:vAlign w:val="center"/>
           </w:tcPr>
           <w:p>
             <w:pPr>
+              <w:jc w:val="center"/>
               <w:rPr>
                 <w:rFonts w:ascii="Times New Roman" w:hAnsi="Times New Roman" w:cs="Times New Roman"/>
               </w:rPr>
@@ -1707,9 +1709,11 @@
         <w:tc>
           <w:tcPr>
             <w:tcW w:w="2337" w:type="dxa"/>
+            <w:vAlign w:val="center"/>
           </w:tcPr>
           <w:p>
             <w:pPr>
+              <w:jc w:val="center"/>
               <w:rPr>
                 <w:rFonts w:ascii="Times New Roman" w:hAnsi="Times New Roman" w:cs="Times New Roman"/>
               </w:rPr>
@@ -1725,9 +1729,11 @@
         <w:tc>
           <w:tcPr>
             <w:tcW w:w="2338" w:type="dxa"/>
+            <w:vAlign w:val="center"/>
           </w:tcPr>
           <w:p>
             <w:pPr>
+              <w:jc w:val="center"/>
               <w:rPr>
                 <w:rFonts w:ascii="Times New Roman" w:hAnsi="Times New Roman" w:cs="Times New Roman"/>
               </w:rPr>
@@ -1743,9 +1749,11 @@
         <w:tc>
           <w:tcPr>
             <w:tcW w:w="2338" w:type="dxa"/>
+            <w:vAlign w:val="center"/>
           </w:tcPr>
           <w:p>
             <w:pPr>
+              <w:jc w:val="center"/>
               <w:rPr>
                 <w:rFonts w:ascii="Times New Roman" w:hAnsi="Times New Roman" w:cs="Times New Roman"/>
               </w:rPr>
@@ -1763,9 +1771,11 @@
         <w:tc>
           <w:tcPr>
             <w:tcW w:w="2337" w:type="dxa"/>
+            <w:vAlign w:val="center"/>
           </w:tcPr>
           <w:p>
             <w:pPr>
+              <w:jc w:val="center"/>
               <w:rPr>
                 <w:rFonts w:ascii="Times New Roman" w:hAnsi="Times New Roman" w:cs="Times New Roman"/>
               </w:rPr>
@@ -1781,9 +1791,11 @@
         <w:tc>
           <w:tcPr>
             <w:tcW w:w="2337" w:type="dxa"/>
+            <w:vAlign w:val="center"/>
           </w:tcPr>
           <w:p>
             <w:pPr>
+              <w:jc w:val="center"/>
               <w:rPr>
                 <w:rFonts w:ascii="Times New Roman" w:hAnsi="Times New Roman" w:cs="Times New Roman"/>
               </w:rPr>
@@ -1811,9 +1823,11 @@
         <w:tc>
           <w:tcPr>
             <w:tcW w:w="2338" w:type="dxa"/>
+            <w:vAlign w:val="center"/>
           </w:tcPr>
           <w:p>
             <w:pPr>
+              <w:jc w:val="center"/>
               <w:rPr>
                 <w:rFonts w:ascii="Times New Roman" w:hAnsi="Times New Roman" w:cs="Times New Roman"/>
               </w:rPr>
@@ -1841,9 +1855,11 @@
         <w:tc>
           <w:tcPr>
             <w:tcW w:w="2338" w:type="dxa"/>
+            <w:vAlign w:val="center"/>
           </w:tcPr>
           <w:p>
             <w:pPr>
+              <w:jc w:val="center"/>
               <w:rPr>
                 <w:rFonts w:ascii="Times New Roman" w:hAnsi="Times New Roman" w:cs="Times New Roman"/>
               </w:rPr>
@@ -1873,9 +1889,11 @@
         <w:tc>
           <w:tcPr>
             <w:tcW w:w="2337" w:type="dxa"/>
+            <w:vAlign w:val="center"/>
           </w:tcPr>
           <w:p>
             <w:pPr>
+              <w:jc w:val="center"/>
               <w:rPr>
                 <w:rFonts w:ascii="Times New Roman" w:hAnsi="Times New Roman" w:cs="Times New Roman"/>
               </w:rPr>
@@ -1891,9 +1909,11 @@
         <w:tc>
           <w:tcPr>
             <w:tcW w:w="2337" w:type="dxa"/>
+            <w:vAlign w:val="center"/>
           </w:tcPr>
           <w:p>
             <w:pPr>
+              <w:jc w:val="center"/>
               <w:rPr>
                 <w:rFonts w:ascii="Times New Roman" w:hAnsi="Times New Roman" w:cs="Times New Roman"/>
               </w:rPr>
@@ -1921,9 +1941,11 @@
         <w:tc>
           <w:tcPr>
             <w:tcW w:w="2338" w:type="dxa"/>
+            <w:vAlign w:val="center"/>
           </w:tcPr>
           <w:p>
             <w:pPr>
+              <w:jc w:val="center"/>
               <w:rPr>
                 <w:rFonts w:ascii="Times New Roman" w:hAnsi="Times New Roman" w:cs="Times New Roman"/>
               </w:rPr>
@@ -1951,9 +1973,11 @@
         <w:tc>
           <w:tcPr>
             <w:tcW w:w="2338" w:type="dxa"/>
+            <w:vAlign w:val="center"/>
           </w:tcPr>
           <w:p>
             <w:pPr>
+              <w:jc w:val="center"/>
               <w:rPr>
                 <w:rFonts w:ascii="Times New Roman" w:hAnsi="Times New Roman" w:cs="Times New Roman"/>
               </w:rPr>
@@ -1983,9 +2007,11 @@
         <w:tc>
           <w:tcPr>
             <w:tcW w:w="2337" w:type="dxa"/>
+            <w:vAlign w:val="center"/>
           </w:tcPr>
           <w:p>
             <w:pPr>
+              <w:jc w:val="center"/>
               <w:rPr>
                 <w:rFonts w:ascii="Times New Roman" w:hAnsi="Times New Roman" w:cs="Times New Roman"/>
               </w:rPr>
@@ -1995,15 +2021,23 @@
                 <w:rFonts w:ascii="Times New Roman" w:hAnsi="Times New Roman" w:cs="Times New Roman"/>
               </w:rPr>
               <w:t>MST</w:t>
+            </w:r>
+            <w:r>
+              <w:rPr>
+                <w:rFonts w:ascii="Times New Roman" w:hAnsi="Times New Roman" w:cs="Times New Roman"/>
+              </w:rPr>
+              <w:t xml:space="preserve"> (Prim)</w:t>
             </w:r>
           </w:p>
         </w:tc>
         <w:tc>
           <w:tcPr>
             <w:tcW w:w="2337" w:type="dxa"/>
+            <w:vAlign w:val="center"/>
           </w:tcPr>
           <w:p>
             <w:pPr>
+              <w:jc w:val="center"/>
               <w:rPr>
                 <w:rFonts w:ascii="Times New Roman" w:hAnsi="Times New Roman" w:cs="Times New Roman"/>
               </w:rPr>
@@ -2025,9 +2059,11 @@
         <w:tc>
           <w:tcPr>
             <w:tcW w:w="2338" w:type="dxa"/>
+            <w:vAlign w:val="center"/>
           </w:tcPr>
           <w:p>
             <w:pPr>
+              <w:jc w:val="center"/>
               <w:rPr>
                 <w:rFonts w:ascii="Times New Roman" w:hAnsi="Times New Roman" w:cs="Times New Roman"/>
               </w:rPr>
@@ -2049,9 +2085,11 @@
         <w:tc>
           <w:tcPr>
             <w:tcW w:w="2338" w:type="dxa"/>
+            <w:vAlign w:val="center"/>
           </w:tcPr>
           <w:p>
             <w:pPr>
+              <w:jc w:val="center"/>
               <w:rPr>
                 <w:rFonts w:ascii="Times New Roman" w:hAnsi="Times New Roman" w:cs="Times New Roman"/>
               </w:rPr>
@@ -2075,9 +2113,11 @@
         <w:tc>
           <w:tcPr>
             <w:tcW w:w="2337" w:type="dxa"/>
+            <w:vAlign w:val="center"/>
           </w:tcPr>
           <w:p>
             <w:pPr>
+              <w:jc w:val="center"/>
               <w:rPr>
                 <w:rFonts w:ascii="Times New Roman" w:hAnsi="Times New Roman" w:cs="Times New Roman"/>
               </w:rPr>
@@ -2086,16 +2126,30 @@
               <w:rPr>
                 <w:rFonts w:ascii="Times New Roman" w:hAnsi="Times New Roman" w:cs="Times New Roman"/>
               </w:rPr>
+              <w:t>Shortest Path (</w:t>
+            </w:r>
+            <w:r>
+              <w:rPr>
+                <w:rFonts w:ascii="Times New Roman" w:hAnsi="Times New Roman" w:cs="Times New Roman"/>
+              </w:rPr>
               <w:t>Bellman-Ford</w:t>
+            </w:r>
+            <w:r>
+              <w:rPr>
+                <w:rFonts w:ascii="Times New Roman" w:hAnsi="Times New Roman" w:cs="Times New Roman"/>
+              </w:rPr>
+              <w:t>)</w:t>
             </w:r>
           </w:p>
         </w:tc>
         <w:tc>
           <w:tcPr>
             <w:tcW w:w="2337" w:type="dxa"/>
+            <w:vAlign w:val="center"/>
           </w:tcPr>
           <w:p>
             <w:pPr>
+              <w:jc w:val="center"/>
               <w:rPr>
                 <w:rFonts w:ascii="Times New Roman" w:hAnsi="Times New Roman" w:cs="Times New Roman"/>
               </w:rPr>
@@ -2117,9 +2171,11 @@
         <w:tc>
           <w:tcPr>
             <w:tcW w:w="2338" w:type="dxa"/>
+            <w:vAlign w:val="center"/>
           </w:tcPr>
           <w:p>
             <w:pPr>
+              <w:jc w:val="center"/>
               <w:rPr>
                 <w:rFonts w:ascii="Times New Roman" w:hAnsi="Times New Roman" w:cs="Times New Roman"/>
               </w:rPr>
@@ -2141,9 +2197,11 @@
         <w:tc>
           <w:tcPr>
             <w:tcW w:w="2338" w:type="dxa"/>
+            <w:vAlign w:val="center"/>
           </w:tcPr>
           <w:p>
             <w:pPr>
+              <w:jc w:val="center"/>
               <w:rPr>
                 <w:rFonts w:ascii="Times New Roman" w:hAnsi="Times New Roman" w:cs="Times New Roman"/>
               </w:rPr>

</xml_diff>

<commit_message>
last paragraph of the conclusion done
</commit_message>
<xml_diff>
--- a/Final Project- Graph Algorithms in Network Optimization .docx
+++ b/Final Project- Graph Algorithms in Network Optimization .docx
@@ -2475,6 +2475,56 @@
           <w:rFonts w:ascii="Times New Roman" w:hAnsi="Times New Roman" w:cs="Times New Roman"/>
         </w:rPr>
         <w:t>.</w:t>
+      </w:r>
+    </w:p>
+    <w:p>
+      <w:pPr>
+        <w:rPr>
+          <w:rFonts w:ascii="Times New Roman" w:hAnsi="Times New Roman" w:cs="Times New Roman"/>
+        </w:rPr>
+      </w:pPr>
+      <w:r>
+        <w:rPr>
+          <w:rFonts w:ascii="Times New Roman" w:hAnsi="Times New Roman" w:cs="Times New Roman"/>
+        </w:rPr>
+        <w:lastRenderedPageBreak/>
+        <w:t xml:space="preserve">The experimental results show that BFS and DFS consistently achieve the lowest execution times across all graph types, with very similar performance due to their simple traversal nature. Prim’s algorithm (MST) shows slightly higher and more variable execution times, especially in the large sparse graph. Bellman-Ford is the slowest among all algorithms in every case, as expected, since it performs repeated edge relaxations to compute </w:t>
+      </w:r>
+      <w:r>
+        <w:rPr>
+          <w:rFonts w:ascii="Times New Roman" w:hAnsi="Times New Roman" w:cs="Times New Roman"/>
+        </w:rPr>
+        <w:t xml:space="preserve">the </w:t>
+      </w:r>
+      <w:r>
+        <w:rPr>
+          <w:rFonts w:ascii="Times New Roman" w:hAnsi="Times New Roman" w:cs="Times New Roman"/>
+        </w:rPr>
+        <w:t xml:space="preserve">shortest paths in </w:t>
+      </w:r>
+      <w:r>
+        <w:rPr>
+          <w:rFonts w:ascii="Times New Roman" w:hAnsi="Times New Roman" w:cs="Times New Roman"/>
+        </w:rPr>
+        <w:t xml:space="preserve">these </w:t>
+      </w:r>
+      <w:r>
+        <w:rPr>
+          <w:rFonts w:ascii="Times New Roman" w:hAnsi="Times New Roman" w:cs="Times New Roman"/>
+        </w:rPr>
+        <w:t xml:space="preserve">weighted graphs. Overall, execution time generally increases </w:t>
+      </w:r>
+      <w:r>
+        <w:rPr>
+          <w:rFonts w:ascii="Times New Roman" w:hAnsi="Times New Roman" w:cs="Times New Roman"/>
+        </w:rPr>
+        <w:t>with the</w:t>
+      </w:r>
+      <w:r>
+        <w:rPr>
+          <w:rFonts w:ascii="Times New Roman" w:hAnsi="Times New Roman" w:cs="Times New Roman"/>
+        </w:rPr>
+        <w:t xml:space="preserve"> graph size and density, with the large dense graph producing higher costs for most algorithms due to the adjacency matrix requiring more edge checks.</w:t>
       </w:r>
     </w:p>
     <w:sectPr>

</xml_diff>